<commit_message>
Added pushbutton IRQ and Quartus FPGA Project
</commit_message>
<xml_diff>
--- a/audioGameDocs/AudioGameDesignReportNolanTuttle.docx
+++ b/audioGameDocs/AudioGameDesignReportNolanTuttle.docx
@@ -1026,6 +1026,7 @@
           <w:szCs w:val="28"/>
         </w:rPr>
       </w:pPr>
+      <w:bookmarkStart w:id="0" w:name="_Hlk213578887"/>
       <w:r>
         <w:rPr>
           <w:b/>
@@ -1155,14 +1156,7 @@
           <w:bCs/>
           <w:color w:val="000000" w:themeColor="text1"/>
         </w:rPr>
-        <w:t xml:space="preserve">S mode at 48 kHz so that it is prepared for audio input from the FPGA over </w:t>
-      </w:r>
-      <w:r>
-        <w:rPr>
-          <w:bCs/>
-          <w:color w:val="000000" w:themeColor="text1"/>
-        </w:rPr>
-        <w:t>I</w:t>
+        <w:t>S mode at 48 kHz so that it is prepared for audio input from the FPGA over I</w:t>
       </w:r>
       <w:r>
         <w:rPr>
@@ -1177,14 +1171,7 @@
           <w:bCs/>
           <w:color w:val="000000" w:themeColor="text1"/>
         </w:rPr>
-        <w:t>S</w:t>
-      </w:r>
-      <w:r>
-        <w:rPr>
-          <w:bCs/>
-          <w:color w:val="000000" w:themeColor="text1"/>
-        </w:rPr>
-        <w:t xml:space="preserve">. </w:t>
+        <w:t xml:space="preserve">S. </w:t>
       </w:r>
       <w:r>
         <w:rPr>
@@ -1270,6 +1257,7 @@
         </w:rPr>
       </w:pPr>
     </w:p>
+    <w:bookmarkEnd w:id="0"/>
     <w:p>
       <w:pPr>
         <w:rPr>
@@ -1921,6 +1909,8 @@
           <w:color w:val="000000" w:themeColor="text1"/>
         </w:rPr>
       </w:pPr>
+      <w:bookmarkStart w:id="1" w:name="_Hlk213588484"/>
+      <w:bookmarkStart w:id="2" w:name="_Hlk213588784"/>
       <w:r>
         <w:rPr>
           <w:i/>
@@ -2996,7 +2986,7 @@
                 <v:stroke joinstyle="miter"/>
                 <v:path gradientshapeok="t" o:connecttype="rect"/>
               </v:shapetype>
-              <v:shape id="Text Box 1" o:spid="_x0000_s1026" type="#_x0000_t202" style="position:absolute;left:0;text-align:left;margin-left:0;margin-top:0;width:706.2pt;height:2in;z-index:251659264;visibility:visible;mso-wrap-style:square;mso-width-percent:0;mso-wrap-distance-left:9pt;mso-wrap-distance-top:0;mso-wrap-distance-right:9pt;mso-wrap-distance-bottom:0;mso-position-horizontal:absolute;mso-position-horizontal-relative:text;mso-position-vertical:absolute;mso-position-vertical-relative:text;mso-width-percent:0;mso-width-relative:margin;v-text-anchor:top" o:gfxdata="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" filled="f" strokeweight=".5pt">
+              <v:shape id="Text Box 1" o:spid="_x0000_s1026" type="#_x0000_t202" style="position:absolute;left:0;text-align:left;margin-left:0;margin-top:0;width:706.2pt;height:2in;z-index:251659264;visibility:visible;mso-wrap-style:square;mso-width-percent:0;mso-wrap-distance-left:9pt;mso-wrap-distance-top:0;mso-wrap-distance-right:9pt;mso-wrap-distance-bottom:0;mso-position-horizontal:absolute;mso-position-horizontal-relative:text;mso-position-vertical:absolute;mso-position-vertical-relative:text;mso-width-percent:0;mso-width-relative:margin;v-text-anchor:top" o:gfxdata="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" filled="f" strokeweight=".5pt">
                 <v:textbox style="mso-fit-shape-to-text:t">
                   <w:txbxContent>
                     <w:p>
@@ -3970,6 +3960,7 @@
         </mc:AlternateContent>
       </w:r>
     </w:p>
+    <w:bookmarkEnd w:id="1"/>
     <w:p>
       <w:pPr>
         <w:jc w:val="center"/>
@@ -3988,16 +3979,7 @@
           <w:szCs w:val="28"/>
         </w:rPr>
         <w:lastRenderedPageBreak/>
-        <w:t>V</w:t>
-      </w:r>
-      <w:r>
-        <w:rPr>
-          <w:b/>
-          <w:color w:val="000000" w:themeColor="text1"/>
-          <w:sz w:val="28"/>
-          <w:szCs w:val="28"/>
-        </w:rPr>
-        <w:t>LSI Design</w:t>
+        <w:t>VLSI Design</w:t>
       </w:r>
     </w:p>
     <w:p>
@@ -4953,8 +4935,18 @@
                                 <w:iCs/>
                                 <w:color w:val="000000" w:themeColor="text1"/>
                               </w:rPr>
-                              <w:t xml:space="preserve"> &lt;= hps_sample_right</w:t>
-                            </w:r>
+                              <w:t xml:space="preserve"> &lt;= </w:t>
+                            </w:r>
+                            <w:proofErr w:type="spellStart"/>
+                            <w:r>
+                              <w:rPr>
+                                <w:rFonts w:ascii="Consolas" w:hAnsi="Consolas" w:cs="Consolas"/>
+                                <w:iCs/>
+                                <w:color w:val="000000" w:themeColor="text1"/>
+                              </w:rPr>
+                              <w:t>hps_sample_right</w:t>
+                            </w:r>
+                            <w:proofErr w:type="spellEnd"/>
                           </w:p>
                           <w:p>
                             <w:pPr>
@@ -5157,8 +5149,7 @@
           </mc:Choice>
           <mc:Fallback>
             <w:pict>
-              <v:shape w14:anchorId="0BDA01F5" id="_x0000_s1027" type="#_x0000_t202" style="position:absolute;margin-left:0;margin-top:17pt;width:2in;height:436pt;z-index:251661312;visibility:visible;mso-wrap-style:none;mso-height-percent:0;mso-wrap-distance-left:9pt;mso-wrap-distance-top:0;mso-wrap-distance-right:9pt;mso-wrap-distance-bottom:0;mso-position-horizontal:absolute;mso-position-horizontal-relative:text;mso-position-vertical:absolute;mso-position-vertical-relative:text;mso-height-percent:0;mso-height-relative:margin;v-text-anchor:top" o:gfxdata="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" filled="f" strokeweight=".5pt">
-                <v:fill o:detectmouseclick="t"/>
+              <v:shape w14:anchorId="0BDA01F5" id="_x0000_s1027" type="#_x0000_t202" style="position:absolute;margin-left:0;margin-top:17pt;width:2in;height:436pt;z-index:251661312;visibility:visible;mso-wrap-style:none;mso-height-percent:0;mso-wrap-distance-left:9pt;mso-wrap-distance-top:0;mso-wrap-distance-right:9pt;mso-wrap-distance-bottom:0;mso-position-horizontal:absolute;mso-position-horizontal-relative:text;mso-position-vertical:absolute;mso-position-vertical-relative:text;mso-height-percent:0;mso-height-relative:margin;v-text-anchor:top" o:gfxdata="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" filled="f" strokeweight=".5pt">
                 <v:textbox>
                   <w:txbxContent>
                     <w:p>
@@ -6064,8 +6055,18 @@
                           <w:iCs/>
                           <w:color w:val="000000" w:themeColor="text1"/>
                         </w:rPr>
-                        <w:t xml:space="preserve"> &lt;= hps_sample_right</w:t>
-                      </w:r>
+                        <w:t xml:space="preserve"> &lt;= </w:t>
+                      </w:r>
+                      <w:proofErr w:type="spellStart"/>
+                      <w:r>
+                        <w:rPr>
+                          <w:rFonts w:ascii="Consolas" w:hAnsi="Consolas" w:cs="Consolas"/>
+                          <w:iCs/>
+                          <w:color w:val="000000" w:themeColor="text1"/>
+                        </w:rPr>
+                        <w:t>hps_sample_right</w:t>
+                      </w:r>
+                      <w:proofErr w:type="spellEnd"/>
                     </w:p>
                     <w:p>
                       <w:pPr>
@@ -6308,14 +6309,7 @@
           <w:i/>
           <w:color w:val="000000" w:themeColor="text1"/>
         </w:rPr>
-        <w:t>HPS to FPGA Register Write</w:t>
-      </w:r>
-      <w:r>
-        <w:rPr>
-          <w:i/>
-          <w:color w:val="000000" w:themeColor="text1"/>
-        </w:rPr>
-        <w:t xml:space="preserve"> Verilog Logic Outline</w:t>
+        <w:t>HPS to FPGA Register Write Verilog Logic Outline</w:t>
       </w:r>
     </w:p>
     <w:p>
@@ -7500,8 +7494,7 @@
           </mc:Choice>
           <mc:Fallback>
             <w:pict>
-              <v:shape w14:anchorId="0230A68B" id="_x0000_s1028" type="#_x0000_t202" style="position:absolute;margin-left:0;margin-top:0;width:2in;height:2in;z-index:251663360;visibility:visible;mso-wrap-style:none;mso-height-percent:0;mso-wrap-distance-left:9pt;mso-wrap-distance-top:0;mso-wrap-distance-right:9pt;mso-wrap-distance-bottom:0;mso-position-horizontal:absolute;mso-position-horizontal-relative:text;mso-position-vertical:absolute;mso-position-vertical-relative:text;mso-height-percent:0;mso-height-relative:margin;v-text-anchor:top" o:gfxdata="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" filled="f" strokeweight=".5pt">
-                <v:fill o:detectmouseclick="t"/>
+              <v:shape w14:anchorId="0230A68B" id="_x0000_s1028" type="#_x0000_t202" style="position:absolute;margin-left:0;margin-top:0;width:2in;height:2in;z-index:251663360;visibility:visible;mso-wrap-style:none;mso-height-percent:0;mso-wrap-distance-left:9pt;mso-wrap-distance-top:0;mso-wrap-distance-right:9pt;mso-wrap-distance-bottom:0;mso-position-horizontal:absolute;mso-position-horizontal-relative:text;mso-position-vertical:absolute;mso-position-vertical-relative:text;mso-height-percent:0;mso-height-relative:margin;v-text-anchor:top" o:gfxdata="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" filled="f" strokeweight=".5pt">
                 <v:textbox style="mso-fit-shape-to-text:t">
                   <w:txbxContent>
                     <w:p>
@@ -8624,7 +8617,9 @@
         </w:rPr>
         <w:tab/>
       </w:r>
+      <w:bookmarkStart w:id="3" w:name="_Hlk213588527"/>
     </w:p>
+    <w:bookmarkEnd w:id="2"/>
     <w:p>
       <w:pPr>
         <w:rPr>
@@ -9837,8 +9832,7 @@
           </mc:Choice>
           <mc:Fallback>
             <w:pict>
-              <v:shape w14:anchorId="0EEEE929" id="_x0000_s1029" type="#_x0000_t202" style="position:absolute;margin-left:0;margin-top:0;width:734pt;height:372.95pt;z-index:251665408;visibility:visible;mso-wrap-style:square;mso-width-percent:0;mso-height-percent:0;mso-wrap-distance-left:9pt;mso-wrap-distance-top:0;mso-wrap-distance-right:9pt;mso-wrap-distance-bottom:0;mso-position-horizontal:absolute;mso-position-horizontal-relative:text;mso-position-vertical:absolute;mso-position-vertical-relative:text;mso-width-percent:0;mso-height-percent:0;mso-width-relative:margin;mso-height-relative:margin;v-text-anchor:top" o:gfxdata="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" o:allowoverlap="f" filled="f" strokeweight=".5pt">
-                <v:fill o:detectmouseclick="t"/>
+              <v:shape w14:anchorId="0EEEE929" id="_x0000_s1029" type="#_x0000_t202" style="position:absolute;margin-left:0;margin-top:0;width:734pt;height:372.95pt;z-index:251665408;visibility:visible;mso-wrap-style:square;mso-width-percent:0;mso-height-percent:0;mso-wrap-distance-left:9pt;mso-wrap-distance-top:0;mso-wrap-distance-right:9pt;mso-wrap-distance-bottom:0;mso-position-horizontal:absolute;mso-position-horizontal-relative:text;mso-position-vertical:absolute;mso-position-vertical-relative:text;mso-width-percent:0;mso-height-percent:0;mso-width-relative:margin;mso-height-relative:margin;v-text-anchor:top" o:gfxdata="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" o:allowoverlap="f" filled="f" strokeweight=".5pt">
                 <v:textbox style="mso-fit-shape-to-text:t">
                   <w:txbxContent>
                     <w:p>
@@ -11048,23 +11042,10 @@
           <w:i/>
           <w:color w:val="000000" w:themeColor="text1"/>
         </w:rPr>
-        <w:t xml:space="preserve">I2S Line Data Transmission </w:t>
-      </w:r>
-      <w:r>
-        <w:rPr>
-          <w:i/>
-          <w:color w:val="000000" w:themeColor="text1"/>
-        </w:rPr>
-        <w:t>Verilog Logic</w:t>
-      </w:r>
-      <w:r>
-        <w:rPr>
-          <w:i/>
-          <w:color w:val="000000" w:themeColor="text1"/>
-        </w:rPr>
-        <w:t xml:space="preserve"> Outline</w:t>
+        <w:t>I2S Line Data Transmission Verilog Logic Outline</w:t>
       </w:r>
     </w:p>
+    <w:bookmarkEnd w:id="3"/>
     <w:p>
       <w:pPr>
         <w:rPr>
@@ -11152,7 +11133,6 @@
           <w:sz w:val="28"/>
           <w:szCs w:val="28"/>
         </w:rPr>
-        <w:lastRenderedPageBreak/>
         <w:t>Risks and Issues</w:t>
       </w:r>
       <w:r>
@@ -11344,7 +11324,7 @@
                 <w:iCs/>
                 <w:color w:val="000000" w:themeColor="text1"/>
               </w:rPr>
-              <w:t xml:space="preserve">Because we are setting the clock rate for the codec using the clock division method (shown above in </w:t>
+              <w:t xml:space="preserve">Because setting the clock rate for the codec using the clock division method (shown above in </w:t>
             </w:r>
             <w:r>
               <w:rPr>
@@ -11798,15 +11778,7 @@
                 <w:iCs/>
                 <w:color w:val="000000" w:themeColor="text1"/>
               </w:rPr>
-              <w:t xml:space="preserve">When configuring the audio codec over I2C </w:t>
-            </w:r>
-            <w:r>
-              <w:rPr>
-                <w:iCs/>
-                <w:color w:val="000000" w:themeColor="text1"/>
-              </w:rPr>
-              <w:lastRenderedPageBreak/>
-              <w:t xml:space="preserve">using the HPS, an incorrect configuration (wrong sampling rate, gain, etc.) (see </w:t>
+              <w:t xml:space="preserve">When configuring the audio codec over I2C using the HPS, an incorrect configuration (wrong sampling rate, gain, etc.) (see </w:t>
             </w:r>
             <w:r>
               <w:rPr>
@@ -11840,7 +11812,6 @@
                 <w:iCs/>
                 <w:color w:val="000000" w:themeColor="text1"/>
               </w:rPr>
-              <w:lastRenderedPageBreak/>
               <w:t>High</w:t>
             </w:r>
           </w:p>
@@ -11901,15 +11872,7 @@
                 <w:iCs/>
                 <w:color w:val="000000" w:themeColor="text1"/>
               </w:rPr>
-              <w:t xml:space="preserve">Validate the correct register writes </w:t>
-            </w:r>
-            <w:r>
-              <w:rPr>
-                <w:iCs/>
-                <w:color w:val="000000" w:themeColor="text1"/>
-              </w:rPr>
-              <w:lastRenderedPageBreak/>
-              <w:t>happen over I2C, test with a known audio codec configuration.</w:t>
+              <w:t>Validate the correct register writes happen over I2C, test with a known audio codec configuration.</w:t>
             </w:r>
           </w:p>
         </w:tc>
@@ -11957,6 +11920,7 @@
           </w14:textOutline>
         </w:rPr>
       </w:pPr>
+      <w:bookmarkStart w:id="4" w:name="_Hlk213588317"/>
       <w:r>
         <w:rPr>
           <w:iCs/>
@@ -12228,6 +12192,7 @@
         </w:rPr>
       </w:pPr>
     </w:p>
+    <w:bookmarkEnd w:id="4"/>
     <w:p>
       <w:pPr>
         <w:jc w:val="center"/>
@@ -12311,12 +12276,12 @@
           <w:color w:val="000000" w:themeColor="text1"/>
         </w:rPr>
       </w:pPr>
+      <w:bookmarkStart w:id="5" w:name="_Hlk213588833"/>
       <w:r>
         <w:rPr>
           <w:i/>
           <w:color w:val="000000" w:themeColor="text1"/>
         </w:rPr>
-        <w:lastRenderedPageBreak/>
         <w:t xml:space="preserve">Figure </w:t>
       </w:r>
       <w:r>
@@ -12364,6 +12329,7 @@
         <w:t>.</w:t>
       </w:r>
     </w:p>
+    <w:bookmarkEnd w:id="5"/>
     <w:p>
       <w:pPr>
         <w:jc w:val="center"/>
@@ -12380,6 +12346,7 @@
           <w:color w:val="000000" w:themeColor="text1"/>
         </w:rPr>
       </w:pPr>
+      <w:bookmarkStart w:id="6" w:name="_Hlk213588343"/>
       <w:r>
         <w:rPr>
           <w:iCs/>
@@ -12387,7 +12354,7 @@
         </w:rPr>
         <w:tab/>
       </w:r>
-      <w:bookmarkStart w:id="0" w:name="OLE_LINK1"/>
+      <w:bookmarkStart w:id="7" w:name="OLE_LINK1"/>
       <w:r>
         <w:rPr>
           <w:iCs/>
@@ -12467,8 +12434,9 @@
         </w:rPr>
         <w:t xml:space="preserve"> however the FPGA must generate accurate clocks. This is an important distinction because it affects the Verilog significantly; the FPGA must generate clocks and thus, requires modules that can help the system function in slave mode.</w:t>
       </w:r>
-      <w:bookmarkEnd w:id="0"/>
+      <w:bookmarkEnd w:id="7"/>
     </w:p>
+    <w:bookmarkEnd w:id="6"/>
     <w:p>
       <w:pPr>
         <w:jc w:val="center"/>
@@ -12496,6 +12464,7 @@
           </w14:textOutline>
         </w:rPr>
       </w:pPr>
+      <w:bookmarkStart w:id="8" w:name="_Hlk213588841"/>
       <w:r>
         <w:rPr>
           <w:i/>
@@ -12579,14 +12548,7 @@
           <w:i/>
           <w:color w:val="000000" w:themeColor="text1"/>
         </w:rPr>
-        <w:t>FPGA Clock</w:t>
-      </w:r>
-      <w:r>
-        <w:rPr>
-          <w:i/>
-          <w:color w:val="000000" w:themeColor="text1"/>
-        </w:rPr>
-        <w:t xml:space="preserve"> </w:t>
+        <w:t xml:space="preserve">FPGA Clock </w:t>
       </w:r>
       <w:r>
         <w:rPr>
@@ -12612,6 +12574,7 @@
         <w:t>.</w:t>
       </w:r>
     </w:p>
+    <w:bookmarkEnd w:id="8"/>
     <w:p>
       <w:pPr>
         <w:jc w:val="center"/>
@@ -12645,7 +12608,6 @@
           <w:noProof/>
           <w:color w:val="5B9BD5" w:themeColor="accent1"/>
         </w:rPr>
-        <w:lastRenderedPageBreak/>
         <w:drawing>
           <wp:inline distT="0" distB="0" distL="0" distR="0" wp14:anchorId="5B54D41D" wp14:editId="30517BF0">
             <wp:extent cx="2862104" cy="6286500"/>
@@ -12702,6 +12664,7 @@
           </w14:textOutline>
         </w:rPr>
       </w:pPr>
+      <w:bookmarkStart w:id="9" w:name="_Hlk213588869"/>
       <w:r>
         <w:rPr>
           <w:i/>
@@ -12714,14 +12677,7 @@
           <w:i/>
           <w:color w:val="000000" w:themeColor="text1"/>
         </w:rPr>
-        <w:t>10</w:t>
-      </w:r>
-      <w:r>
-        <w:rPr>
-          <w:i/>
-          <w:color w:val="000000" w:themeColor="text1"/>
-        </w:rPr>
-        <w:t xml:space="preserve">: </w:t>
+        <w:t xml:space="preserve">10: </w:t>
       </w:r>
       <w:r>
         <w:rPr>
@@ -12738,6 +12694,7 @@
         <w:t>File Tree Structure for Audio Game project</w:t>
       </w:r>
     </w:p>
+    <w:bookmarkEnd w:id="9"/>
     <w:p>
       <w:pPr>
         <w:jc w:val="center"/>
@@ -12769,6 +12726,7 @@
           </w14:textOutline>
         </w:rPr>
       </w:pPr>
+      <w:bookmarkStart w:id="10" w:name="_Hlk213588380"/>
     </w:p>
     <w:p>
       <w:pPr>
@@ -12825,6 +12783,7 @@
         </w:rPr>
         <w:t>Beyond Circuits. (n.d.). Tutorial 19: I2S Transmitter. Retrieved October 18, 2025, from https://www.beyond-circuits.com/wordpress/tutorial/tutorial19/</w:t>
       </w:r>
+      <w:bookmarkEnd w:id="10"/>
     </w:p>
     <w:sectPr>
       <w:footerReference w:type="default" r:id="rId19"/>
@@ -13918,15 +13877,6 @@
 </file>
 
 <file path=customXml/item1.xml><?xml version="1.0" encoding="utf-8"?>
-<?mso-contentType ?>
-<FormTemplates xmlns="http://schemas.microsoft.com/sharepoint/v3/contenttype/forms">
-  <Display>DocumentLibraryForm</Display>
-  <Edit>DocumentLibraryForm</Edit>
-  <New>DocumentLibraryForm</New>
-</FormTemplates>
-</file>
-
-<file path=customXml/item2.xml><?xml version="1.0" encoding="utf-8"?>
 <ct:contentTypeSchema xmlns:ct="http://schemas.microsoft.com/office/2006/metadata/contentType" xmlns:ma="http://schemas.microsoft.com/office/2006/metadata/properties/metaAttributes" ct:_="" ma:_="" ma:contentTypeName="Document" ma:contentTypeID="0x010100B9FDC2B66788A044965A7B8958E6244A" ma:contentTypeVersion="1261" ma:contentTypeDescription="Create a new document." ma:contentTypeScope="" ma:versionID="eeb6e483105304fef357f080bd49ffc1">
   <xsd:schema xmlns:xsd="http://www.w3.org/2001/XMLSchema" xmlns:xs="http://www.w3.org/2001/XMLSchema" xmlns:p="http://schemas.microsoft.com/office/2006/metadata/properties" xmlns:ns1="http://schemas.microsoft.com/sharepoint/v3" xmlns:ns2="d6188da8-f31e-469a-aed4-03a23c44e36a" xmlns:ns3="37d47695-dda2-48a2-87bc-2a1f7ac7fedc" targetNamespace="http://schemas.microsoft.com/office/2006/metadata/properties" ma:root="true" ma:fieldsID="cd2c777aa7c45d4c1f54b5c3d82211ac" ns1:_="" ns2:_="" ns3:_="">
     <xsd:import namespace="http://schemas.microsoft.com/sharepoint/v3"/>
@@ -14198,7 +14148,7 @@
 </ct:contentTypeSchema>
 </file>
 
-<file path=customXml/item3.xml><?xml version="1.0" encoding="utf-8"?>
+<file path=customXml/item2.xml><?xml version="1.0" encoding="utf-8"?>
 <p:properties xmlns:p="http://schemas.microsoft.com/office/2006/metadata/properties" xmlns:xsi="http://www.w3.org/2001/XMLSchema-instance" xmlns:pc="http://schemas.microsoft.com/office/infopath/2007/PartnerControls">
   <documentManagement>
     <_ip_UnifiedCompliancePolicyUIAction xmlns="http://schemas.microsoft.com/sharepoint/v3" xsi:nil="true"/>
@@ -14211,15 +14161,16 @@
 </p:properties>
 </file>
 
-<file path=customXml/itemProps1.xml><?xml version="1.0" encoding="utf-8"?>
-<ds:datastoreItem xmlns:ds="http://schemas.openxmlformats.org/officeDocument/2006/customXml" ds:itemID="{DFBD4CEE-1B9B-4A3B-B0C3-455E87B01705}">
-  <ds:schemaRefs>
-    <ds:schemaRef ds:uri="http://schemas.microsoft.com/sharepoint/v3/contenttype/forms"/>
-  </ds:schemaRefs>
-</ds:datastoreItem>
+<file path=customXml/item3.xml><?xml version="1.0" encoding="utf-8"?>
+<?mso-contentType ?>
+<FormTemplates xmlns="http://schemas.microsoft.com/sharepoint/v3/contenttype/forms">
+  <Display>DocumentLibraryForm</Display>
+  <Edit>DocumentLibraryForm</Edit>
+  <New>DocumentLibraryForm</New>
+</FormTemplates>
 </file>
 
-<file path=customXml/itemProps2.xml><?xml version="1.0" encoding="utf-8"?>
+<file path=customXml/itemProps1.xml><?xml version="1.0" encoding="utf-8"?>
 <ds:datastoreItem xmlns:ds="http://schemas.openxmlformats.org/officeDocument/2006/customXml" ds:itemID="{B4349A1A-FB03-4E65-AB7C-F987FAF74A7A}">
   <ds:schemaRefs>
     <ds:schemaRef ds:uri="http://schemas.microsoft.com/office/2006/metadata/contentType"/>
@@ -14239,7 +14190,7 @@
 </ds:datastoreItem>
 </file>
 
-<file path=customXml/itemProps3.xml><?xml version="1.0" encoding="utf-8"?>
+<file path=customXml/itemProps2.xml><?xml version="1.0" encoding="utf-8"?>
 <ds:datastoreItem xmlns:ds="http://schemas.openxmlformats.org/officeDocument/2006/customXml" ds:itemID="{A6A6DD55-D88E-481F-9862-067B31D74358}">
   <ds:schemaRefs>
     <ds:schemaRef ds:uri="http://schemas.microsoft.com/office/2006/metadata/properties"/>
@@ -14249,4 +14200,12 @@
     <ds:schemaRef ds:uri="d6188da8-f31e-469a-aed4-03a23c44e36a"/>
   </ds:schemaRefs>
 </ds:datastoreItem>
+</file>
+
+<file path=customXml/itemProps3.xml><?xml version="1.0" encoding="utf-8"?>
+<ds:datastoreItem xmlns:ds="http://schemas.openxmlformats.org/officeDocument/2006/customXml" ds:itemID="{DFBD4CEE-1B9B-4A3B-B0C3-455E87B01705}">
+  <ds:schemaRefs>
+    <ds:schemaRef ds:uri="http://schemas.microsoft.com/sharepoint/v3/contenttype/forms"/>
+  </ds:schemaRefs>
+</ds:datastoreItem>
 </file>
</xml_diff>